<commit_message>
Insert funding statement; submission package complete (0 markers)
Funding: Universiti Malaya Research Grant RU004-2025H. READ_ME status set to
ready; editorial log R5-13.

Co-Authored-By: Claude Fable 5.1 <noreply@anthropic.com>
Claude-Session: https://claude.ai/code/session_011m1nWiFCs4xdp8CXy2DSzu
</commit_message>
<xml_diff>
--- a/DFT_paper_revision/SUBMISSION_PACKAGE/00_READ_ME_FIRST.docx
+++ b/DFT_paper_revision/SUBMISSION_PACKAGE/00_READ_ME_FIRST.docx
@@ -60,13 +60,13 @@
         <w:t xml:space="preserve">(PR #5)</w:t>
       </w:r>
     </w:p>
-    <w:bookmarkStart w:id="20" w:name="X66153879d29958bb8983b121f31ab4667369a87"/>
+    <w:bookmarkStart w:id="20" w:name="status-ready-to-upload"/>
     <w:p>
       <w:pPr>
         <w:pStyle w:val="Heading2"/>
       </w:pPr>
       <w:r>
-        <w:t xml:space="preserve">Status: ready to upload once the Funding statement is written</w:t>
+        <w:t xml:space="preserve">Status: ready to upload</w:t>
       </w:r>
     </w:p>
     <w:p>
@@ -74,23 +74,7 @@
         <w:pStyle w:val="FirstParagraph"/>
       </w:pPr>
       <w:r>
-        <w:t xml:space="preserve">Every [AUTHOR ACTION] note has been resolved except one: the</w:t>
-      </w:r>
-      <w:r>
-        <w:t xml:space="preserve"> </w:t>
-      </w:r>
-      <w:r>
-        <w:rPr>
-          <w:bCs/>
-          <w:b/>
-        </w:rPr>
-        <w:t xml:space="preserve">Funding</w:t>
-      </w:r>
-      <w:r>
-        <w:t xml:space="preserve"> </w:t>
-      </w:r>
-      <w:r>
-        <w:t xml:space="preserve">section of the manuscript still holds a bracketed placeholder that only the authors can fill (grant numbers, or Elsevier’s standard sentence</w:t>
+        <w:t xml:space="preserve">Every [AUTHOR ACTION] note has been resolved. The Funding section reads</w:t>
       </w:r>
       <w:r>
         <w:t xml:space="preserve"> </w:t>
@@ -99,13 +83,10 @@
         <w:t xml:space="preserve">“</w:t>
       </w:r>
       <w:r>
-        <w:t xml:space="preserve">This research did not receive any specific grant from funding agencies in the public, commercial, or not-for-profit sectors.</w:t>
+        <w:t xml:space="preserve">This work was supported by the Universiti Malaya Research Grant [grant number RU004-2025H].</w:t>
       </w:r>
       <w:r>
         <w:t xml:space="preserve">”</w:t>
-      </w:r>
-      <w:r>
-        <w:t xml:space="preserve">).</w:t>
       </w:r>
       <w:r>
         <w:t xml:space="preserve"> </w:t>
@@ -120,7 +101,7 @@
         <w:t xml:space="preserve"> </w:t>
       </w:r>
       <w:r>
-        <w:t xml:space="preserve">prints the number of markers left in both Word files; it must read 0 before upload. The internal</w:t>
+        <w:t xml:space="preserve">reports 0 markers in both Word files. The internal</w:t>
       </w:r>
       <w:r>
         <w:t xml:space="preserve"> </w:t>
@@ -634,13 +615,13 @@
       </w:tr>
     </w:tbl>
     <w:bookmarkEnd w:id="21"/>
-    <w:bookmarkStart w:id="22" w:name="a.-the-one-required-item"/>
+    <w:bookmarkStart w:id="22" w:name="a.-optional-before-upload"/>
     <w:p>
       <w:pPr>
         <w:pStyle w:val="Heading2"/>
       </w:pPr>
       <w:r>
-        <w:t xml:space="preserve">A. The one required item</w:t>
+        <w:t xml:space="preserve">A. Optional before upload</w:t>
       </w:r>
     </w:p>
     <w:p>
@@ -656,54 +637,6 @@
           <w:bCs/>
           <w:b/>
         </w:rPr>
-        <w:t xml:space="preserve">Funding statement</w:t>
-      </w:r>
-      <w:r>
-        <w:t xml:space="preserve"> </w:t>
-      </w:r>
-      <w:r>
-        <w:t xml:space="preserve">— replace the bracket in the Funding section with grant numbers, or with the standard</w:t>
-      </w:r>
-      <w:r>
-        <w:t xml:space="preserve"> </w:t>
-      </w:r>
-      <w:r>
-        <w:t xml:space="preserve">“</w:t>
-      </w:r>
-      <w:r>
-        <w:t xml:space="preserve">did not receive any specific grant</w:t>
-      </w:r>
-      <w:r>
-        <w:t xml:space="preserve">”</w:t>
-      </w:r>
-      <w:r>
-        <w:t xml:space="preserve"> </w:t>
-      </w:r>
-      <w:r>
-        <w:t xml:space="preserve">sentence.</w:t>
-      </w:r>
-    </w:p>
-    <w:p>
-      <w:pPr>
-        <w:pStyle w:val="FirstParagraph"/>
-      </w:pPr>
-      <w:r>
-        <w:t xml:space="preserve">Optional before upload:</w:t>
-      </w:r>
-      <w:r>
-        <w:t xml:space="preserve"> </w:t>
-      </w:r>
-      <w:r>
-        <w:t xml:space="preserve">-</w:t>
-      </w:r>
-      <w:r>
-        <w:t xml:space="preserve"> </w:t>
-      </w:r>
-      <w:r>
-        <w:rPr>
-          <w:bCs/>
-          <w:b/>
-        </w:rPr>
         <w:t xml:space="preserve">Zenodo deposit.</w:t>
       </w:r>
       <w:r>
@@ -712,15 +645,15 @@
       <w:r>
         <w:t xml:space="preserve">The Data availability statement now says the files are available on request and will be deposited with a DOI on acceptance. If you deposit folder 07 (plus your QE inputs/outputs, pseudopotentials and ACF.dat files) before submission, replace that sentence with the DOI.</w:t>
       </w:r>
-      <w:r>
-        <w:t xml:space="preserve"> </w:t>
-      </w:r>
-      <w:r>
-        <w:t xml:space="preserve">-</w:t>
-      </w:r>
-      <w:r>
-        <w:t xml:space="preserve"> </w:t>
-      </w:r>
+    </w:p>
+    <w:p>
+      <w:pPr>
+        <w:numPr>
+          <w:ilvl w:val="0"/>
+          <w:numId w:val="1001"/>
+        </w:numPr>
+        <w:pStyle w:val="Compact"/>
+      </w:pPr>
       <w:r>
         <w:rPr>
           <w:bCs/>
@@ -734,15 +667,15 @@
       <w:r>
         <w:t xml:space="preserve">It now states the facts (text editing, consistency checks, Python plotting scripts; no image generated or altered). Elsevier’s policy on AI-assisted figure scripts is not explicit; asking the editorial office is prudent but not required.</w:t>
       </w:r>
-      <w:r>
-        <w:t xml:space="preserve"> </w:t>
-      </w:r>
-      <w:r>
-        <w:t xml:space="preserve">-</w:t>
-      </w:r>
-      <w:r>
-        <w:t xml:space="preserve"> </w:t>
-      </w:r>
+    </w:p>
+    <w:p>
+      <w:pPr>
+        <w:numPr>
+          <w:ilvl w:val="0"/>
+          <w:numId w:val="1001"/>
+        </w:numPr>
+        <w:pStyle w:val="Compact"/>
+      </w:pPr>
       <w:r>
         <w:rPr>
           <w:bCs/>
@@ -1058,7 +991,16 @@
         <w:pStyle w:val="Compact"/>
       </w:pPr>
       <w:r>
-        <w:t xml:space="preserve">Search both Word files for</w:t>
+        <w:rPr>
+          <w:rStyle w:val="VerbatimChar"/>
+        </w:rPr>
+        <w:t xml:space="preserve">tools_package.sh</w:t>
+      </w:r>
+      <w:r>
+        <w:t xml:space="preserve"> </w:t>
+      </w:r>
+      <w:r>
+        <w:t xml:space="preserve">reports 0</w:t>
       </w:r>
       <w:r>
         <w:t xml:space="preserve"> </w:t>
@@ -1073,22 +1015,7 @@
         <w:t xml:space="preserve"> </w:t>
       </w:r>
       <w:r>
-        <w:t xml:space="preserve">— the count must be zero (only the Funding placeholder remains;</w:t>
-      </w:r>
-      <w:r>
-        <w:t xml:space="preserve"> </w:t>
-      </w:r>
-      <w:r>
-        <w:rPr>
-          <w:rStyle w:val="VerbatimChar"/>
-        </w:rPr>
-        <w:t xml:space="preserve">tools_package.sh</w:t>
-      </w:r>
-      <w:r>
-        <w:t xml:space="preserve"> </w:t>
-      </w:r>
-      <w:r>
-        <w:t xml:space="preserve">prints the count).</w:t>
+        <w:t xml:space="preserve">markers in both Word files; if you edit the sources again, re-run it and check that line.</w:t>
       </w:r>
     </w:p>
     <w:p>
@@ -1266,91 +1193,6 @@
       </w:pPr>
     </w:lvl>
   </w:abstractNum>
-  <w:abstractNum w:abstractNumId="99411">
-    <w:nsid w:val="A99411"/>
-    <w:multiLevelType w:val="multilevel"/>
-    <w:lvl w:ilvl="0">
-      <w:start w:val="1"/>
-      <w:numFmt w:val="decimal"/>
-      <w:lvlText w:val="%1."/>
-      <w:lvlJc w:val="left"/>
-      <w:pPr>
-        <w:ind w:left="720" w:hanging="480"/>
-      </w:pPr>
-    </w:lvl>
-    <w:lvl w:ilvl="1">
-      <w:start w:val="1"/>
-      <w:numFmt w:val="decimal"/>
-      <w:lvlText w:val="%2."/>
-      <w:lvlJc w:val="left"/>
-      <w:pPr>
-        <w:ind w:left="1440" w:hanging="480"/>
-      </w:pPr>
-    </w:lvl>
-    <w:lvl w:ilvl="2">
-      <w:start w:val="1"/>
-      <w:numFmt w:val="decimal"/>
-      <w:lvlText w:val="%3."/>
-      <w:lvlJc w:val="left"/>
-      <w:pPr>
-        <w:ind w:left="2160" w:hanging="480"/>
-      </w:pPr>
-    </w:lvl>
-    <w:lvl w:ilvl="3">
-      <w:start w:val="1"/>
-      <w:numFmt w:val="decimal"/>
-      <w:lvlText w:val="%4."/>
-      <w:lvlJc w:val="left"/>
-      <w:pPr>
-        <w:ind w:left="2880" w:hanging="480"/>
-      </w:pPr>
-    </w:lvl>
-    <w:lvl w:ilvl="4">
-      <w:start w:val="1"/>
-      <w:numFmt w:val="decimal"/>
-      <w:lvlText w:val="%5."/>
-      <w:lvlJc w:val="left"/>
-      <w:pPr>
-        <w:ind w:left="3600" w:hanging="480"/>
-      </w:pPr>
-    </w:lvl>
-    <w:lvl w:ilvl="5">
-      <w:start w:val="1"/>
-      <w:numFmt w:val="decimal"/>
-      <w:lvlText w:val="%6."/>
-      <w:lvlJc w:val="left"/>
-      <w:pPr>
-        <w:ind w:left="4320" w:hanging="480"/>
-      </w:pPr>
-    </w:lvl>
-    <w:lvl w:ilvl="6">
-      <w:start w:val="1"/>
-      <w:numFmt w:val="decimal"/>
-      <w:lvlText w:val="%7."/>
-      <w:lvlJc w:val="left"/>
-      <w:pPr>
-        <w:ind w:left="5040" w:hanging="480"/>
-      </w:pPr>
-    </w:lvl>
-    <w:lvl w:ilvl="7">
-      <w:start w:val="1"/>
-      <w:numFmt w:val="decimal"/>
-      <w:lvlText w:val="%8."/>
-      <w:lvlJc w:val="left"/>
-      <w:pPr>
-        <w:ind w:left="5760" w:hanging="480"/>
-      </w:pPr>
-    </w:lvl>
-    <w:lvl w:ilvl="8">
-      <w:start w:val="1"/>
-      <w:numFmt w:val="decimal"/>
-      <w:lvlText w:val="%9."/>
-      <w:lvlJc w:val="left"/>
-      <w:pPr>
-        <w:ind w:left="6480" w:hanging="480"/>
-      </w:pPr>
-    </w:lvl>
-  </w:abstractNum>
   <w:abstractNum w:abstractNumId="991">
     <w:nsid w:val="A991"/>
     <w:multiLevelType w:val="multilevel"/>
@@ -1431,34 +1273,7 @@
     <w:abstractNumId w:val="990"/>
   </w:num>
   <w:num w:numId="1001">
-    <w:abstractNumId w:val="99411"/>
-    <w:lvlOverride w:ilvl="0">
-      <w:startOverride w:val="1"/>
-    </w:lvlOverride>
-    <w:lvlOverride w:ilvl="1">
-      <w:startOverride w:val="1"/>
-    </w:lvlOverride>
-    <w:lvlOverride w:ilvl="2">
-      <w:startOverride w:val="1"/>
-    </w:lvlOverride>
-    <w:lvlOverride w:ilvl="3">
-      <w:startOverride w:val="1"/>
-    </w:lvlOverride>
-    <w:lvlOverride w:ilvl="4">
-      <w:startOverride w:val="1"/>
-    </w:lvlOverride>
-    <w:lvlOverride w:ilvl="5">
-      <w:startOverride w:val="1"/>
-    </w:lvlOverride>
-    <w:lvlOverride w:ilvl="6">
-      <w:startOverride w:val="1"/>
-    </w:lvlOverride>
-    <w:lvlOverride w:ilvl="7">
-      <w:startOverride w:val="1"/>
-    </w:lvlOverride>
-    <w:lvlOverride w:ilvl="8">
-      <w:startOverride w:val="1"/>
-    </w:lvlOverride>
+    <w:abstractNumId w:val="991"/>
   </w:num>
   <w:num w:numId="1002">
     <w:abstractNumId w:val="991"/>

</xml_diff>

<commit_message>
Apply verified handoff checks: abstract to 250 Word-counted words, drop stale Figure S3 citation, refresh READ_ME
Four independent checkers reviewed HANDOFF.md against the repository; a
fixer applied the confirmed corrections. Three findings concerned the
upload files themselves and are fixed here: the abstract was 251 words by
Word's count (tools_rebuild.sh now counts the same way), section 3.1 still
cited the removed Figure S3, and the READ_ME carried old counts and dates.

Co-Authored-By: Claude Opus 5.5 <noreply@anthropic.com>
Claude-Session: https://claude.ai/code/session_011m1nWiFCs4xdp8CXy2DSzu
</commit_message>
<xml_diff>
--- a/DFT_paper_revision/SUBMISSION_PACKAGE/00_READ_ME_FIRST.docx
+++ b/DFT_paper_revision/SUBMISSION_PACKAGE/00_READ_ME_FIRST.docx
@@ -42,7 +42,7 @@
         <w:t xml:space="preserve"> </w:t>
       </w:r>
       <w:r>
-        <w:t xml:space="preserve">4 October 2026 (round 5), from branch</w:t>
+        <w:t xml:space="preserve">13 October 2026 (round 5, final checks), from branch</w:t>
       </w:r>
       <w:r>
         <w:t xml:space="preserve"> </w:t>
@@ -101,7 +101,7 @@
         <w:t xml:space="preserve"> </w:t>
       </w:r>
       <w:r>
-        <w:t xml:space="preserve">reports 0 markers in both Word files. The internal</w:t>
+        <w:t xml:space="preserve">reports 0 markers in the cover letter, manuscript, highlights and SI. The internal</w:t>
       </w:r>
       <w:r>
         <w:t xml:space="preserve"> </w:t>
@@ -345,7 +345,7 @@
               <w:jc w:val="left"/>
             </w:pPr>
             <w:r>
-              <w:t xml:space="preserve">Title page, abstract (248 words), text, tables, figure captions, references (50).</w:t>
+              <w:t xml:space="preserve">Title page, abstract (250 words, counted as Word counts), text, tables, figure captions, references (50).</w:t>
             </w:r>
             <w:r>
               <w:t xml:space="preserve"> </w:t>
@@ -1015,7 +1015,7 @@
         <w:t xml:space="preserve"> </w:t>
       </w:r>
       <w:r>
-        <w:t xml:space="preserve">markers in both Word files; if you edit the sources again, re-run it and check that line.</w:t>
+        <w:t xml:space="preserve">markers in the cover letter, manuscript, highlights and SI; if you edit the sources again, re-run it and check those lines.</w:t>
       </w:r>
     </w:p>
     <w:p>
@@ -1039,7 +1039,17 @@
         <w:pStyle w:val="Compact"/>
       </w:pPr>
       <w:r>
-        <w:t xml:space="preserve">Suggested reviewers (optional in Editorial Manager): choose researchers you have cited but not co-authored with.</w:t>
+        <w:rPr>
+          <w:bCs/>
+          <w:b/>
+        </w:rPr>
+        <w:t xml:space="preserve">Suggested reviewers:</w:t>
+      </w:r>
+      <w:r>
+        <w:t xml:space="preserve"> </w:t>
+      </w:r>
+      <w:r>
+        <w:t xml:space="preserve">the cover letter says they are listed in the submission system, so enter 3–5 in Editorial Manager (researchers you cite on DFT+U defects in TiO₂ or alkali/rare-earth doping of oxides; none from Universiti Malaya or recent co-authors).</w:t>
       </w:r>
     </w:p>
     <w:p>

</xml_diff>